<commit_message>
Enhance Thesis Management Interface with new Thesis View and dynamic data loading
</commit_message>
<xml_diff>
--- a/Main Project Breif Doc.docx
+++ b/Main Project Breif Doc.docx
@@ -553,7 +553,7 @@
           <w:noProof/>
         </w:rPr>
         <w:drawing>
-          <wp:anchor distT="0" distB="0" distL="114300" distR="114300" simplePos="0" relativeHeight="251659264" behindDoc="0" locked="0" layoutInCell="1" allowOverlap="1" wp14:anchorId="6784BBF7" wp14:editId="55222F6C">
+          <wp:anchor distT="0" distB="0" distL="114300" distR="114300" simplePos="0" relativeHeight="251659264" behindDoc="0" locked="0" layoutInCell="1" allowOverlap="1" wp14:anchorId="6784BBF7" wp14:editId="681EBCD1">
             <wp:simplePos x="0" y="0"/>
             <wp:positionH relativeFrom="margin">
               <wp:align>right</wp:align>
@@ -613,7 +613,7 @@
           <w:noProof/>
         </w:rPr>
         <w:drawing>
-          <wp:anchor distT="0" distB="0" distL="114300" distR="114300" simplePos="0" relativeHeight="251660288" behindDoc="0" locked="0" layoutInCell="1" allowOverlap="1" wp14:anchorId="5A2686F4" wp14:editId="47424A1E">
+          <wp:anchor distT="0" distB="0" distL="114300" distR="114300" simplePos="0" relativeHeight="251660288" behindDoc="0" locked="0" layoutInCell="1" allowOverlap="1" wp14:anchorId="5A2686F4" wp14:editId="31962539">
             <wp:simplePos x="0" y="0"/>
             <wp:positionH relativeFrom="column">
               <wp:posOffset>-672948</wp:posOffset>
@@ -825,6 +825,7 @@
           <w:sz w:val="28"/>
           <w:szCs w:val="28"/>
           <w:u w:val="single"/>
+          <w:lang w:val="fr-FR"/>
         </w:rPr>
       </w:pPr>
       <w:r>
@@ -1001,6 +1002,7 @@
           </wp:anchor>
         </w:drawing>
       </w:r>
+      <w:proofErr w:type="spellStart"/>
       <w:r>
         <w:rPr>
           <w:b/>
@@ -1009,26 +1011,68 @@
           <w:szCs w:val="28"/>
           <w:highlight w:val="yellow"/>
           <w:u w:val="single"/>
-        </w:rPr>
-        <w:t>Colour palette testing:</w:t>
-      </w:r>
-    </w:p>
-    <w:p>
-      <w:pPr>
+          <w:lang w:val="fr-FR"/>
+        </w:rPr>
+        <w:t>Colour</w:t>
+      </w:r>
+      <w:proofErr w:type="spellEnd"/>
+      <w:r>
         <w:rPr>
           <w:b/>
           <w:bCs/>
           <w:sz w:val="28"/>
           <w:szCs w:val="28"/>
-          <w:u w:val="single"/>
-        </w:rPr>
-      </w:pPr>
-    </w:p>
-    <w:p>
-      <w:pPr>
-        <w:rPr>
+          <w:highlight w:val="yellow"/>
+          <w:u w:val="single"/>
+          <w:lang w:val="fr-FR"/>
+        </w:rPr>
+        <w:t xml:space="preserve"> palette </w:t>
+      </w:r>
+      <w:proofErr w:type="spellStart"/>
+      <w:r>
+        <w:rPr>
+          <w:b/>
+          <w:bCs/>
           <w:sz w:val="28"/>
           <w:szCs w:val="28"/>
+          <w:highlight w:val="yellow"/>
+          <w:u w:val="single"/>
+          <w:lang w:val="fr-FR"/>
+        </w:rPr>
+        <w:t>testing</w:t>
+      </w:r>
+      <w:proofErr w:type="spellEnd"/>
+      <w:r>
+        <w:rPr>
+          <w:b/>
+          <w:bCs/>
+          <w:sz w:val="28"/>
+          <w:szCs w:val="28"/>
+          <w:highlight w:val="yellow"/>
+          <w:u w:val="single"/>
+          <w:lang w:val="fr-FR"/>
+        </w:rPr>
+        <w:t>:</w:t>
+      </w:r>
+    </w:p>
+    <w:p>
+      <w:pPr>
+        <w:rPr>
+          <w:b/>
+          <w:bCs/>
+          <w:sz w:val="28"/>
+          <w:szCs w:val="28"/>
+          <w:u w:val="single"/>
+          <w:lang w:val="fr-FR"/>
+        </w:rPr>
+      </w:pPr>
+    </w:p>
+    <w:p>
+      <w:pPr>
+        <w:rPr>
+          <w:sz w:val="28"/>
+          <w:szCs w:val="28"/>
+          <w:lang w:val="fr-FR"/>
         </w:rPr>
       </w:pPr>
       <w:r>
@@ -1157,6 +1201,7 @@
         <w:pStyle w:val="Heading1"/>
         <w:rPr>
           <w:color w:val="1A3A5C"/>
+          <w:lang w:val="fr-FR"/>
         </w:rPr>
       </w:pPr>
     </w:p>
@@ -1165,6 +1210,7 @@
         <w:pStyle w:val="Heading1"/>
         <w:rPr>
           <w:color w:val="1A3A5C"/>
+          <w:lang w:val="fr-FR"/>
         </w:rPr>
       </w:pPr>
     </w:p>
@@ -1173,6 +1219,7 @@
         <w:pStyle w:val="Heading1"/>
         <w:rPr>
           <w:color w:val="1A3A5C"/>
+          <w:lang w:val="fr-FR"/>
         </w:rPr>
       </w:pPr>
     </w:p>
@@ -2277,10 +2324,7 @@
               <w:spacing w:before="40" w:after="40"/>
             </w:pPr>
             <w:r>
-              <w:t>Because my app is designed for all investors it’s important that people with disabilities can use it.</w:t>
-            </w:r>
-            <w:r>
-              <w:t xml:space="preserve"> With increasing amounts of people interested in the stock market I think</w:t>
+              <w:t>Because my app is designed for all investors it’s important that people with disabilities can use it. With increasing amounts of people interested in the stock market I think</w:t>
             </w:r>
             <w:r>
               <w:t xml:space="preserve"> there will be a increasing amount of disabled people looking for an inclusive interface which allows them to invest like any other person,</w:t>
@@ -3146,6 +3190,243 @@
     <w:p/>
     <w:p>
       <w:pPr>
+        <w:rPr>
+          <w:b/>
+          <w:bCs/>
+          <w:sz w:val="28"/>
+          <w:szCs w:val="28"/>
+          <w:u w:val="single"/>
+        </w:rPr>
+      </w:pPr>
+      <w:r>
+        <w:rPr>
+          <w:b/>
+          <w:bCs/>
+          <w:sz w:val="28"/>
+          <w:szCs w:val="28"/>
+          <w:highlight w:val="yellow"/>
+          <w:u w:val="single"/>
+        </w:rPr>
+        <w:t>Name: Nikhil</w:t>
+      </w:r>
+      <w:r>
+        <w:rPr>
+          <w:b/>
+          <w:bCs/>
+          <w:sz w:val="28"/>
+          <w:szCs w:val="28"/>
+          <w:u w:val="single"/>
+        </w:rPr>
+        <w:t xml:space="preserve"> </w:t>
+      </w:r>
+      <w:r>
+        <w:rPr>
+          <w:b/>
+          <w:bCs/>
+          <w:sz w:val="28"/>
+          <w:szCs w:val="28"/>
+          <w:u w:val="single"/>
+        </w:rPr>
+        <w:t xml:space="preserve"> - Aesthetic and features feedback:</w:t>
+      </w:r>
+    </w:p>
+    <w:p>
+      <w:pPr>
+        <w:rPr>
+          <w:sz w:val="28"/>
+          <w:szCs w:val="28"/>
+        </w:rPr>
+      </w:pPr>
+      <w:r>
+        <w:rPr>
+          <w:sz w:val="28"/>
+          <w:szCs w:val="28"/>
+        </w:rPr>
+        <w:t>What my interface currently looks like:</w:t>
+      </w:r>
+    </w:p>
+    <w:p>
+      <w:pPr>
+        <w:rPr>
+          <w:b/>
+          <w:bCs/>
+          <w:sz w:val="28"/>
+          <w:szCs w:val="28"/>
+          <w:u w:val="single"/>
+        </w:rPr>
+      </w:pPr>
+      <w:r>
+        <w:rPr>
+          <w:u w:val="single"/>
+        </w:rPr>
+        <w:lastRenderedPageBreak/>
+        <w:drawing>
+          <wp:anchor distT="0" distB="0" distL="114300" distR="114300" simplePos="0" relativeHeight="251676672" behindDoc="0" locked="0" layoutInCell="1" allowOverlap="1" wp14:anchorId="6FC8A3A3" wp14:editId="20105DA1">
+            <wp:simplePos x="0" y="0"/>
+            <wp:positionH relativeFrom="margin">
+              <wp:posOffset>4322957</wp:posOffset>
+            </wp:positionH>
+            <wp:positionV relativeFrom="paragraph">
+              <wp:posOffset>449</wp:posOffset>
+            </wp:positionV>
+            <wp:extent cx="2065020" cy="2005965"/>
+            <wp:effectExtent l="0" t="0" r="0" b="0"/>
+            <wp:wrapSquare wrapText="bothSides"/>
+            <wp:docPr id="1213361084" name="Picture 1"/>
+            <wp:cNvGraphicFramePr>
+              <a:graphicFrameLocks xmlns:a="http://schemas.openxmlformats.org/drawingml/2006/main" noChangeAspect="1"/>
+            </wp:cNvGraphicFramePr>
+            <a:graphic xmlns:a="http://schemas.openxmlformats.org/drawingml/2006/main">
+              <a:graphicData uri="http://schemas.openxmlformats.org/drawingml/2006/picture">
+                <pic:pic xmlns:pic="http://schemas.openxmlformats.org/drawingml/2006/picture">
+                  <pic:nvPicPr>
+                    <pic:cNvPr id="1213361084" name=""/>
+                    <pic:cNvPicPr/>
+                  </pic:nvPicPr>
+                  <pic:blipFill>
+                    <a:blip r:embed="rId20"/>
+                    <a:stretch>
+                      <a:fillRect/>
+                    </a:stretch>
+                  </pic:blipFill>
+                  <pic:spPr>
+                    <a:xfrm>
+                      <a:off x="0" y="0"/>
+                      <a:ext cx="2065020" cy="2005965"/>
+                    </a:xfrm>
+                    <a:prstGeom prst="rect">
+                      <a:avLst/>
+                    </a:prstGeom>
+                  </pic:spPr>
+                </pic:pic>
+              </a:graphicData>
+            </a:graphic>
+            <wp14:sizeRelH relativeFrom="margin">
+              <wp14:pctWidth>0</wp14:pctWidth>
+            </wp14:sizeRelH>
+            <wp14:sizeRelV relativeFrom="margin">
+              <wp14:pctHeight>0</wp14:pctHeight>
+            </wp14:sizeRelV>
+          </wp:anchor>
+        </w:drawing>
+      </w:r>
+      <w:r>
+        <w:drawing>
+          <wp:anchor distT="0" distB="0" distL="114300" distR="114300" simplePos="0" relativeHeight="251674624" behindDoc="0" locked="0" layoutInCell="1" allowOverlap="1" wp14:anchorId="4DCB6E13" wp14:editId="4AAE99E6">
+            <wp:simplePos x="0" y="0"/>
+            <wp:positionH relativeFrom="column">
+              <wp:posOffset>2772410</wp:posOffset>
+            </wp:positionH>
+            <wp:positionV relativeFrom="paragraph">
+              <wp:posOffset>0</wp:posOffset>
+            </wp:positionV>
+            <wp:extent cx="1550035" cy="1560830"/>
+            <wp:effectExtent l="0" t="0" r="0" b="1270"/>
+            <wp:wrapSquare wrapText="bothSides"/>
+            <wp:docPr id="727292193" name="Picture 1"/>
+            <wp:cNvGraphicFramePr>
+              <a:graphicFrameLocks xmlns:a="http://schemas.openxmlformats.org/drawingml/2006/main" noChangeAspect="1"/>
+            </wp:cNvGraphicFramePr>
+            <a:graphic xmlns:a="http://schemas.openxmlformats.org/drawingml/2006/main">
+              <a:graphicData uri="http://schemas.openxmlformats.org/drawingml/2006/picture">
+                <pic:pic xmlns:pic="http://schemas.openxmlformats.org/drawingml/2006/picture">
+                  <pic:nvPicPr>
+                    <pic:cNvPr id="727292193" name=""/>
+                    <pic:cNvPicPr/>
+                  </pic:nvPicPr>
+                  <pic:blipFill>
+                    <a:blip r:embed="rId21"/>
+                    <a:stretch>
+                      <a:fillRect/>
+                    </a:stretch>
+                  </pic:blipFill>
+                  <pic:spPr>
+                    <a:xfrm>
+                      <a:off x="0" y="0"/>
+                      <a:ext cx="1550035" cy="1560830"/>
+                    </a:xfrm>
+                    <a:prstGeom prst="rect">
+                      <a:avLst/>
+                    </a:prstGeom>
+                  </pic:spPr>
+                </pic:pic>
+              </a:graphicData>
+            </a:graphic>
+            <wp14:sizeRelH relativeFrom="margin">
+              <wp14:pctWidth>0</wp14:pctWidth>
+            </wp14:sizeRelH>
+            <wp14:sizeRelV relativeFrom="margin">
+              <wp14:pctHeight>0</wp14:pctHeight>
+            </wp14:sizeRelV>
+          </wp:anchor>
+        </w:drawing>
+      </w:r>
+      <w:r>
+        <w:rPr>
+          <w:b/>
+          <w:bCs/>
+          <w:sz w:val="28"/>
+          <w:szCs w:val="28"/>
+          <w:u w:val="single"/>
+        </w:rPr>
+        <w:drawing>
+          <wp:anchor distT="0" distB="0" distL="114300" distR="114300" simplePos="0" relativeHeight="251672576" behindDoc="0" locked="0" layoutInCell="1" allowOverlap="1" wp14:anchorId="797BD80F" wp14:editId="0766BA97">
+            <wp:simplePos x="0" y="0"/>
+            <wp:positionH relativeFrom="page">
+              <wp:posOffset>958850</wp:posOffset>
+            </wp:positionH>
+            <wp:positionV relativeFrom="paragraph">
+              <wp:posOffset>36830</wp:posOffset>
+            </wp:positionV>
+            <wp:extent cx="2435860" cy="1568450"/>
+            <wp:effectExtent l="0" t="0" r="2540" b="0"/>
+            <wp:wrapSquare wrapText="bothSides"/>
+            <wp:docPr id="1650258603" name="Picture 1"/>
+            <wp:cNvGraphicFramePr>
+              <a:graphicFrameLocks xmlns:a="http://schemas.openxmlformats.org/drawingml/2006/main" noChangeAspect="1"/>
+            </wp:cNvGraphicFramePr>
+            <a:graphic xmlns:a="http://schemas.openxmlformats.org/drawingml/2006/main">
+              <a:graphicData uri="http://schemas.openxmlformats.org/drawingml/2006/picture">
+                <pic:pic xmlns:pic="http://schemas.openxmlformats.org/drawingml/2006/picture">
+                  <pic:nvPicPr>
+                    <pic:cNvPr id="1650258603" name=""/>
+                    <pic:cNvPicPr/>
+                  </pic:nvPicPr>
+                  <pic:blipFill>
+                    <a:blip r:embed="rId22"/>
+                    <a:stretch>
+                      <a:fillRect/>
+                    </a:stretch>
+                  </pic:blipFill>
+                  <pic:spPr>
+                    <a:xfrm>
+                      <a:off x="0" y="0"/>
+                      <a:ext cx="2435860" cy="1568450"/>
+                    </a:xfrm>
+                    <a:prstGeom prst="rect">
+                      <a:avLst/>
+                    </a:prstGeom>
+                  </pic:spPr>
+                </pic:pic>
+              </a:graphicData>
+            </a:graphic>
+            <wp14:sizeRelH relativeFrom="margin">
+              <wp14:pctWidth>0</wp14:pctWidth>
+            </wp14:sizeRelH>
+            <wp14:sizeRelV relativeFrom="margin">
+              <wp14:pctHeight>0</wp14:pctHeight>
+            </wp14:sizeRelV>
+          </wp:anchor>
+        </w:drawing>
+      </w:r>
+    </w:p>
+    <w:p/>
+    <w:p/>
+    <w:p/>
+    <w:p/>
+    <w:p/>
+    <w:p>
+      <w:pPr>
         <w:pStyle w:val="ListParagraph"/>
         <w:rPr>
           <w:u w:val="single"/>
@@ -3226,7 +3507,7 @@
           <w:numId w:val="2"/>
         </w:numPr>
       </w:pPr>
-      <w:hyperlink r:id="rId20" w:history="1">
+      <w:hyperlink r:id="rId23" w:history="1">
         <w:r>
           <w:rPr>
             <w:rStyle w:val="Hyperlink"/>
@@ -3243,7 +3524,7 @@
           <w:numId w:val="2"/>
         </w:numPr>
       </w:pPr>
-      <w:hyperlink r:id="rId21" w:history="1">
+      <w:hyperlink r:id="rId24" w:history="1">
         <w:r>
           <w:rPr>
             <w:rStyle w:val="Hyperlink"/>
@@ -3258,7 +3539,7 @@
           <w:noProof/>
         </w:rPr>
         <w:drawing>
-          <wp:inline distT="0" distB="0" distL="0" distR="0" wp14:anchorId="66EED7A4" wp14:editId="73D397C6">
+          <wp:inline distT="0" distB="0" distL="0" distR="0" wp14:anchorId="66EED7A4" wp14:editId="033608AC">
             <wp:extent cx="1829857" cy="1116855"/>
             <wp:effectExtent l="0" t="0" r="0" b="7620"/>
             <wp:docPr id="2099634707" name="Picture 1"/>
@@ -3273,7 +3554,7 @@
                     <pic:cNvPicPr/>
                   </pic:nvPicPr>
                   <pic:blipFill>
-                    <a:blip r:embed="rId22" cstate="print">
+                    <a:blip r:embed="rId25" cstate="print">
                       <a:extLst>
                         <a:ext uri="{28A0092B-C50C-407E-A947-70E740481C1C}">
                           <a14:useLocalDpi xmlns:a14="http://schemas.microsoft.com/office/drawing/2010/main" val="0"/>
@@ -3319,7 +3600,7 @@
                     <pic:cNvPicPr/>
                   </pic:nvPicPr>
                   <pic:blipFill>
-                    <a:blip r:embed="rId23" cstate="print">
+                    <a:blip r:embed="rId26" cstate="print">
                       <a:extLst>
                         <a:ext uri="{28A0092B-C50C-407E-A947-70E740481C1C}">
                           <a14:useLocalDpi xmlns:a14="http://schemas.microsoft.com/office/drawing/2010/main" val="0"/>
@@ -3365,7 +3646,7 @@
                     <pic:cNvPicPr/>
                   </pic:nvPicPr>
                   <pic:blipFill>
-                    <a:blip r:embed="rId24" cstate="print">
+                    <a:blip r:embed="rId27" cstate="print">
                       <a:extLst>
                         <a:ext uri="{28A0092B-C50C-407E-A947-70E740481C1C}">
                           <a14:useLocalDpi xmlns:a14="http://schemas.microsoft.com/office/drawing/2010/main" val="0"/>
@@ -4968,7 +5249,7 @@
   <w:style w:type="paragraph" w:default="1" w:styleId="Normal">
     <w:name w:val="Normal"/>
     <w:qFormat/>
-    <w:rsid w:val="009E718D"/>
+    <w:rsid w:val="00187C26"/>
   </w:style>
   <w:style w:type="paragraph" w:styleId="Heading1">
     <w:name w:val="heading 1"/>

</xml_diff>

<commit_message>
Refactor JournalHome and JournalLanding pages for improved layout and styling; update dashboard widgets and add confidence distribution chart
</commit_message>
<xml_diff>
--- a/Main Project Breif Doc.docx
+++ b/Main Project Breif Doc.docx
@@ -553,7 +553,7 @@
           <w:noProof/>
         </w:rPr>
         <w:drawing>
-          <wp:anchor distT="0" distB="0" distL="114300" distR="114300" simplePos="0" relativeHeight="251659264" behindDoc="0" locked="0" layoutInCell="1" allowOverlap="1" wp14:anchorId="6784BBF7" wp14:editId="681EBCD1">
+          <wp:anchor distT="0" distB="0" distL="114300" distR="114300" simplePos="0" relativeHeight="251659264" behindDoc="0" locked="0" layoutInCell="1" allowOverlap="1" wp14:anchorId="6784BBF7" wp14:editId="1C3EA80E">
             <wp:simplePos x="0" y="0"/>
             <wp:positionH relativeFrom="margin">
               <wp:align>right</wp:align>
@@ -613,7 +613,7 @@
           <w:noProof/>
         </w:rPr>
         <w:drawing>
-          <wp:anchor distT="0" distB="0" distL="114300" distR="114300" simplePos="0" relativeHeight="251660288" behindDoc="0" locked="0" layoutInCell="1" allowOverlap="1" wp14:anchorId="5A2686F4" wp14:editId="31962539">
+          <wp:anchor distT="0" distB="0" distL="114300" distR="114300" simplePos="0" relativeHeight="251660288" behindDoc="0" locked="0" layoutInCell="1" allowOverlap="1" wp14:anchorId="5A2686F4" wp14:editId="0763D713">
             <wp:simplePos x="0" y="0"/>
             <wp:positionH relativeFrom="column">
               <wp:posOffset>-672948</wp:posOffset>
@@ -3230,200 +3230,6 @@
         <w:t xml:space="preserve"> - Aesthetic and features feedback:</w:t>
       </w:r>
     </w:p>
-    <w:p>
-      <w:pPr>
-        <w:rPr>
-          <w:sz w:val="28"/>
-          <w:szCs w:val="28"/>
-        </w:rPr>
-      </w:pPr>
-      <w:r>
-        <w:rPr>
-          <w:sz w:val="28"/>
-          <w:szCs w:val="28"/>
-        </w:rPr>
-        <w:t>What my interface currently looks like:</w:t>
-      </w:r>
-    </w:p>
-    <w:p>
-      <w:pPr>
-        <w:rPr>
-          <w:b/>
-          <w:bCs/>
-          <w:sz w:val="28"/>
-          <w:szCs w:val="28"/>
-          <w:u w:val="single"/>
-        </w:rPr>
-      </w:pPr>
-      <w:r>
-        <w:rPr>
-          <w:u w:val="single"/>
-        </w:rPr>
-        <w:lastRenderedPageBreak/>
-        <w:drawing>
-          <wp:anchor distT="0" distB="0" distL="114300" distR="114300" simplePos="0" relativeHeight="251676672" behindDoc="0" locked="0" layoutInCell="1" allowOverlap="1" wp14:anchorId="6FC8A3A3" wp14:editId="20105DA1">
-            <wp:simplePos x="0" y="0"/>
-            <wp:positionH relativeFrom="margin">
-              <wp:posOffset>4322957</wp:posOffset>
-            </wp:positionH>
-            <wp:positionV relativeFrom="paragraph">
-              <wp:posOffset>449</wp:posOffset>
-            </wp:positionV>
-            <wp:extent cx="2065020" cy="2005965"/>
-            <wp:effectExtent l="0" t="0" r="0" b="0"/>
-            <wp:wrapSquare wrapText="bothSides"/>
-            <wp:docPr id="1213361084" name="Picture 1"/>
-            <wp:cNvGraphicFramePr>
-              <a:graphicFrameLocks xmlns:a="http://schemas.openxmlformats.org/drawingml/2006/main" noChangeAspect="1"/>
-            </wp:cNvGraphicFramePr>
-            <a:graphic xmlns:a="http://schemas.openxmlformats.org/drawingml/2006/main">
-              <a:graphicData uri="http://schemas.openxmlformats.org/drawingml/2006/picture">
-                <pic:pic xmlns:pic="http://schemas.openxmlformats.org/drawingml/2006/picture">
-                  <pic:nvPicPr>
-                    <pic:cNvPr id="1213361084" name=""/>
-                    <pic:cNvPicPr/>
-                  </pic:nvPicPr>
-                  <pic:blipFill>
-                    <a:blip r:embed="rId20"/>
-                    <a:stretch>
-                      <a:fillRect/>
-                    </a:stretch>
-                  </pic:blipFill>
-                  <pic:spPr>
-                    <a:xfrm>
-                      <a:off x="0" y="0"/>
-                      <a:ext cx="2065020" cy="2005965"/>
-                    </a:xfrm>
-                    <a:prstGeom prst="rect">
-                      <a:avLst/>
-                    </a:prstGeom>
-                  </pic:spPr>
-                </pic:pic>
-              </a:graphicData>
-            </a:graphic>
-            <wp14:sizeRelH relativeFrom="margin">
-              <wp14:pctWidth>0</wp14:pctWidth>
-            </wp14:sizeRelH>
-            <wp14:sizeRelV relativeFrom="margin">
-              <wp14:pctHeight>0</wp14:pctHeight>
-            </wp14:sizeRelV>
-          </wp:anchor>
-        </w:drawing>
-      </w:r>
-      <w:r>
-        <w:drawing>
-          <wp:anchor distT="0" distB="0" distL="114300" distR="114300" simplePos="0" relativeHeight="251674624" behindDoc="0" locked="0" layoutInCell="1" allowOverlap="1" wp14:anchorId="4DCB6E13" wp14:editId="4AAE99E6">
-            <wp:simplePos x="0" y="0"/>
-            <wp:positionH relativeFrom="column">
-              <wp:posOffset>2772410</wp:posOffset>
-            </wp:positionH>
-            <wp:positionV relativeFrom="paragraph">
-              <wp:posOffset>0</wp:posOffset>
-            </wp:positionV>
-            <wp:extent cx="1550035" cy="1560830"/>
-            <wp:effectExtent l="0" t="0" r="0" b="1270"/>
-            <wp:wrapSquare wrapText="bothSides"/>
-            <wp:docPr id="727292193" name="Picture 1"/>
-            <wp:cNvGraphicFramePr>
-              <a:graphicFrameLocks xmlns:a="http://schemas.openxmlformats.org/drawingml/2006/main" noChangeAspect="1"/>
-            </wp:cNvGraphicFramePr>
-            <a:graphic xmlns:a="http://schemas.openxmlformats.org/drawingml/2006/main">
-              <a:graphicData uri="http://schemas.openxmlformats.org/drawingml/2006/picture">
-                <pic:pic xmlns:pic="http://schemas.openxmlformats.org/drawingml/2006/picture">
-                  <pic:nvPicPr>
-                    <pic:cNvPr id="727292193" name=""/>
-                    <pic:cNvPicPr/>
-                  </pic:nvPicPr>
-                  <pic:blipFill>
-                    <a:blip r:embed="rId21"/>
-                    <a:stretch>
-                      <a:fillRect/>
-                    </a:stretch>
-                  </pic:blipFill>
-                  <pic:spPr>
-                    <a:xfrm>
-                      <a:off x="0" y="0"/>
-                      <a:ext cx="1550035" cy="1560830"/>
-                    </a:xfrm>
-                    <a:prstGeom prst="rect">
-                      <a:avLst/>
-                    </a:prstGeom>
-                  </pic:spPr>
-                </pic:pic>
-              </a:graphicData>
-            </a:graphic>
-            <wp14:sizeRelH relativeFrom="margin">
-              <wp14:pctWidth>0</wp14:pctWidth>
-            </wp14:sizeRelH>
-            <wp14:sizeRelV relativeFrom="margin">
-              <wp14:pctHeight>0</wp14:pctHeight>
-            </wp14:sizeRelV>
-          </wp:anchor>
-        </w:drawing>
-      </w:r>
-      <w:r>
-        <w:rPr>
-          <w:b/>
-          <w:bCs/>
-          <w:sz w:val="28"/>
-          <w:szCs w:val="28"/>
-          <w:u w:val="single"/>
-        </w:rPr>
-        <w:drawing>
-          <wp:anchor distT="0" distB="0" distL="114300" distR="114300" simplePos="0" relativeHeight="251672576" behindDoc="0" locked="0" layoutInCell="1" allowOverlap="1" wp14:anchorId="797BD80F" wp14:editId="0766BA97">
-            <wp:simplePos x="0" y="0"/>
-            <wp:positionH relativeFrom="page">
-              <wp:posOffset>958850</wp:posOffset>
-            </wp:positionH>
-            <wp:positionV relativeFrom="paragraph">
-              <wp:posOffset>36830</wp:posOffset>
-            </wp:positionV>
-            <wp:extent cx="2435860" cy="1568450"/>
-            <wp:effectExtent l="0" t="0" r="2540" b="0"/>
-            <wp:wrapSquare wrapText="bothSides"/>
-            <wp:docPr id="1650258603" name="Picture 1"/>
-            <wp:cNvGraphicFramePr>
-              <a:graphicFrameLocks xmlns:a="http://schemas.openxmlformats.org/drawingml/2006/main" noChangeAspect="1"/>
-            </wp:cNvGraphicFramePr>
-            <a:graphic xmlns:a="http://schemas.openxmlformats.org/drawingml/2006/main">
-              <a:graphicData uri="http://schemas.openxmlformats.org/drawingml/2006/picture">
-                <pic:pic xmlns:pic="http://schemas.openxmlformats.org/drawingml/2006/picture">
-                  <pic:nvPicPr>
-                    <pic:cNvPr id="1650258603" name=""/>
-                    <pic:cNvPicPr/>
-                  </pic:nvPicPr>
-                  <pic:blipFill>
-                    <a:blip r:embed="rId22"/>
-                    <a:stretch>
-                      <a:fillRect/>
-                    </a:stretch>
-                  </pic:blipFill>
-                  <pic:spPr>
-                    <a:xfrm>
-                      <a:off x="0" y="0"/>
-                      <a:ext cx="2435860" cy="1568450"/>
-                    </a:xfrm>
-                    <a:prstGeom prst="rect">
-                      <a:avLst/>
-                    </a:prstGeom>
-                  </pic:spPr>
-                </pic:pic>
-              </a:graphicData>
-            </a:graphic>
-            <wp14:sizeRelH relativeFrom="margin">
-              <wp14:pctWidth>0</wp14:pctWidth>
-            </wp14:sizeRelH>
-            <wp14:sizeRelV relativeFrom="margin">
-              <wp14:pctHeight>0</wp14:pctHeight>
-            </wp14:sizeRelV>
-          </wp:anchor>
-        </w:drawing>
-      </w:r>
-    </w:p>
-    <w:p/>
-    <w:p/>
-    <w:p/>
-    <w:p/>
     <w:p/>
     <w:p>
       <w:pPr>
@@ -3507,7 +3313,7 @@
           <w:numId w:val="2"/>
         </w:numPr>
       </w:pPr>
-      <w:hyperlink r:id="rId23" w:history="1">
+      <w:hyperlink r:id="rId20" w:history="1">
         <w:r>
           <w:rPr>
             <w:rStyle w:val="Hyperlink"/>
@@ -3524,7 +3330,7 @@
           <w:numId w:val="2"/>
         </w:numPr>
       </w:pPr>
-      <w:hyperlink r:id="rId24" w:history="1">
+      <w:hyperlink r:id="rId21" w:history="1">
         <w:r>
           <w:rPr>
             <w:rStyle w:val="Hyperlink"/>
@@ -3554,7 +3360,7 @@
                     <pic:cNvPicPr/>
                   </pic:nvPicPr>
                   <pic:blipFill>
-                    <a:blip r:embed="rId25" cstate="print">
+                    <a:blip r:embed="rId22" cstate="print">
                       <a:extLst>
                         <a:ext uri="{28A0092B-C50C-407E-A947-70E740481C1C}">
                           <a14:useLocalDpi xmlns:a14="http://schemas.microsoft.com/office/drawing/2010/main" val="0"/>
@@ -3600,7 +3406,7 @@
                     <pic:cNvPicPr/>
                   </pic:nvPicPr>
                   <pic:blipFill>
-                    <a:blip r:embed="rId26" cstate="print">
+                    <a:blip r:embed="rId23" cstate="print">
                       <a:extLst>
                         <a:ext uri="{28A0092B-C50C-407E-A947-70E740481C1C}">
                           <a14:useLocalDpi xmlns:a14="http://schemas.microsoft.com/office/drawing/2010/main" val="0"/>
@@ -3646,7 +3452,7 @@
                     <pic:cNvPicPr/>
                   </pic:nvPicPr>
                   <pic:blipFill>
-                    <a:blip r:embed="rId27" cstate="print">
+                    <a:blip r:embed="rId24" cstate="print">
                       <a:extLst>
                         <a:ext uri="{28A0092B-C50C-407E-A947-70E740481C1C}">
                           <a14:useLocalDpi xmlns:a14="http://schemas.microsoft.com/office/drawing/2010/main" val="0"/>

</xml_diff>